<commit_message>
commit du rendu final de la doc et du code
</commit_message>
<xml_diff>
--- a/doc/Version_4/Fichier de modification/2113_DeElectronique-MOD-v4.docx
+++ b/doc/Version_4/Fichier de modification/2113_DeElectronique-MOD-v4.docx
@@ -5,38 +5,41 @@
     <w:p>
       <w:pPr>
         <w:pStyle w:val="Titre"/>
-      </w:pPr>
-      <w:r>
+        <w:rPr>
+          <w:lang w:val="de-CH"/>
+        </w:rPr>
+      </w:pPr>
+      <w:proofErr w:type="spellStart"/>
+      <w:r>
+        <w:rPr>
+          <w:lang w:val="de-CH"/>
+        </w:rPr>
         <w:t>Projet</w:t>
       </w:r>
-      <w:r>
+      <w:proofErr w:type="spellEnd"/>
+      <w:r>
+        <w:rPr>
+          <w:lang w:val="de-CH"/>
+        </w:rPr>
         <w:t xml:space="preserve"> ETML-ES – </w:t>
       </w:r>
-      <w:commentRangeStart w:id="0"/>
-      <w:r>
-        <w:t>Modification</w:t>
-      </w:r>
-      <w:r>
-        <w:t xml:space="preserve"> –</w:t>
-      </w:r>
-      <w:commentRangeEnd w:id="0"/>
-      <w:r>
-        <w:rPr>
-          <w:rStyle w:val="Marquedecommentaire"/>
-          <w:rFonts w:asciiTheme="minorHAnsi" w:eastAsiaTheme="minorHAnsi" w:hAnsiTheme="minorHAnsi" w:cstheme="minorBidi"/>
-          <w:color w:val="auto"/>
-          <w:spacing w:val="0"/>
-          <w:kern w:val="0"/>
-        </w:rPr>
-        <w:commentReference w:id="0"/>
-      </w:r>
-      <w:r>
-        <w:t xml:space="preserve"> </w:t>
+      <w:r>
+        <w:rPr>
+          <w:lang w:val="de-CH"/>
+        </w:rPr>
+        <w:t>Hard/soft</w:t>
+      </w:r>
+      <w:r>
+        <w:rPr>
+          <w:lang w:val="de-CH"/>
+        </w:rPr>
+        <w:t xml:space="preserve"> – </w:t>
       </w:r>
       <w:r>
         <w:rPr>
           <w:sz w:val="32"/>
           <w:szCs w:val="32"/>
+          <w:lang w:val="de-CH"/>
         </w:rPr>
         <w:t>« Hard/Soft »</w:t>
       </w:r>
@@ -47,11 +50,19 @@
           <w:i/>
         </w:rPr>
       </w:pPr>
-      <w:r>
-        <w:rPr>
-          <w:i/>
-        </w:rPr>
-        <w:t>Note: Les textes explicatifs en italique peuvent être supprimés</w:t>
+      <w:proofErr w:type="gramStart"/>
+      <w:r>
+        <w:rPr>
+          <w:i/>
+        </w:rPr>
+        <w:t>Note:</w:t>
+      </w:r>
+      <w:proofErr w:type="gramEnd"/>
+      <w:r>
+        <w:rPr>
+          <w:i/>
+        </w:rPr>
+        <w:t xml:space="preserve"> Les textes explicatifs en italique peuvent être supprimés</w:t>
       </w:r>
     </w:p>
     <w:p>
@@ -92,6 +103,7 @@
                 <w:rStyle w:val="lev"/>
               </w:rPr>
             </w:pPr>
+            <w:proofErr w:type="gramStart"/>
             <w:r>
               <w:rPr>
                 <w:rStyle w:val="lev"/>
@@ -104,6 +116,7 @@
               </w:rPr>
               <w:t>ROJET:</w:t>
             </w:r>
+            <w:proofErr w:type="gramEnd"/>
           </w:p>
         </w:tc>
         <w:tc>
@@ -116,11 +129,16 @@
               <w:t>2113 D</w:t>
             </w:r>
             <w:r>
-              <w:t>-s</w:t>
+              <w:t>-</w:t>
+            </w:r>
+            <w:proofErr w:type="spellStart"/>
+            <w:r>
+              <w:t>s</w:t>
             </w:r>
             <w:r>
               <w:t>Electronique</w:t>
             </w:r>
+            <w:proofErr w:type="spellEnd"/>
           </w:p>
         </w:tc>
       </w:tr>
@@ -140,8 +158,16 @@
               <w:rPr>
                 <w:rStyle w:val="lev"/>
               </w:rPr>
-              <w:t>Entreprise/Client:</w:t>
-            </w:r>
+              <w:t>Entreprise/</w:t>
+            </w:r>
+            <w:proofErr w:type="gramStart"/>
+            <w:r>
+              <w:rPr>
+                <w:rStyle w:val="lev"/>
+              </w:rPr>
+              <w:t>Client:</w:t>
+            </w:r>
+            <w:proofErr w:type="gramEnd"/>
           </w:p>
         </w:tc>
         <w:tc>
@@ -165,12 +191,14 @@
                 <w:b/>
               </w:rPr>
             </w:pPr>
+            <w:proofErr w:type="gramStart"/>
             <w:r>
               <w:rPr>
                 <w:b/>
               </w:rPr>
               <w:t>Département:</w:t>
             </w:r>
+            <w:proofErr w:type="gramEnd"/>
           </w:p>
         </w:tc>
         <w:tc>
@@ -205,7 +233,14 @@
               <w:rPr>
                 <w:rStyle w:val="lev"/>
               </w:rPr>
-              <w:t>Demandé par (Prénom, Nom)</w:t>
+              <w:t>Demandé par (Prénom, Nom</w:t>
+            </w:r>
+            <w:proofErr w:type="gramStart"/>
+            <w:r>
+              <w:rPr>
+                <w:rStyle w:val="lev"/>
+              </w:rPr>
+              <w:t>)</w:t>
             </w:r>
             <w:r>
               <w:rPr>
@@ -213,6 +248,7 @@
               </w:rPr>
               <w:t>:</w:t>
             </w:r>
+            <w:proofErr w:type="gramEnd"/>
           </w:p>
         </w:tc>
         <w:tc>
@@ -227,6 +263,7 @@
             <w:shd w:val="clear" w:color="auto" w:fill="C5E0B3" w:themeFill="accent6" w:themeFillTint="66"/>
           </w:tcPr>
           <w:p>
+            <w:proofErr w:type="gramStart"/>
             <w:r>
               <w:rPr>
                 <w:rStyle w:val="lev"/>
@@ -239,6 +276,7 @@
               </w:rPr>
               <w:t>:</w:t>
             </w:r>
+            <w:proofErr w:type="gramEnd"/>
           </w:p>
         </w:tc>
         <w:tc>
@@ -303,8 +341,13 @@
           </w:tcPr>
           <w:p>
             <w:r>
-              <w:t>Software / Firmware</w:t>
-            </w:r>
+              <w:t xml:space="preserve">Software / </w:t>
+            </w:r>
+            <w:proofErr w:type="spellStart"/>
+            <w:r>
+              <w:t>Firmware</w:t>
+            </w:r>
+            <w:proofErr w:type="spellEnd"/>
           </w:p>
         </w:tc>
       </w:tr>
@@ -334,8 +377,16 @@
               <w:rPr>
                 <w:rStyle w:val="lev"/>
               </w:rPr>
-              <w:t xml:space="preserve"> à modifier:</w:t>
-            </w:r>
+              <w:t xml:space="preserve"> à </w:t>
+            </w:r>
+            <w:proofErr w:type="gramStart"/>
+            <w:r>
+              <w:rPr>
+                <w:rStyle w:val="lev"/>
+              </w:rPr>
+              <w:t>modifier:</w:t>
+            </w:r>
+            <w:proofErr w:type="gramEnd"/>
           </w:p>
         </w:tc>
         <w:tc>
@@ -396,8 +447,16 @@
               <w:rPr>
                 <w:rStyle w:val="lev"/>
               </w:rPr>
-              <w:t>Auteur (ETML-ES):</w:t>
-            </w:r>
+              <w:t>Auteur (ETML-ES</w:t>
+            </w:r>
+            <w:proofErr w:type="gramStart"/>
+            <w:r>
+              <w:rPr>
+                <w:rStyle w:val="lev"/>
+              </w:rPr>
+              <w:t>):</w:t>
+            </w:r>
+            <w:proofErr w:type="gramEnd"/>
           </w:p>
         </w:tc>
         <w:tc>
@@ -421,12 +480,14 @@
                 <w:b/>
               </w:rPr>
             </w:pPr>
+            <w:proofErr w:type="gramStart"/>
             <w:r>
               <w:rPr>
                 <w:b/>
               </w:rPr>
               <w:t>Filière:</w:t>
             </w:r>
+            <w:proofErr w:type="gramEnd"/>
           </w:p>
         </w:tc>
         <w:tc>
@@ -456,8 +517,16 @@
               <w:rPr>
                 <w:rStyle w:val="lev"/>
               </w:rPr>
-              <w:t>Nouvelle version:</w:t>
-            </w:r>
+              <w:t xml:space="preserve">Nouvelle </w:t>
+            </w:r>
+            <w:proofErr w:type="gramStart"/>
+            <w:r>
+              <w:rPr>
+                <w:rStyle w:val="lev"/>
+              </w:rPr>
+              <w:t>version:</w:t>
+            </w:r>
+            <w:proofErr w:type="gramEnd"/>
           </w:p>
         </w:tc>
         <w:tc>
@@ -481,12 +550,14 @@
                 <w:b/>
               </w:rPr>
             </w:pPr>
+            <w:proofErr w:type="gramStart"/>
             <w:r>
               <w:rPr>
                 <w:b/>
               </w:rPr>
               <w:t>Date:</w:t>
             </w:r>
+            <w:proofErr w:type="gramEnd"/>
           </w:p>
         </w:tc>
         <w:tc>
@@ -531,7 +602,23 @@
           <w:i/>
           <w:iCs/>
         </w:rPr>
-        <w:t>lors de l’initialisation afin tester toutes les LEDs une seule fois lors de la mise sous tension.</w:t>
+        <w:t xml:space="preserve">lors de l’initialisation afin tester toutes les </w:t>
+      </w:r>
+      <w:proofErr w:type="spellStart"/>
+      <w:r>
+        <w:rPr>
+          <w:i/>
+          <w:iCs/>
+        </w:rPr>
+        <w:t>LEDs</w:t>
+      </w:r>
+      <w:proofErr w:type="spellEnd"/>
+      <w:r>
+        <w:rPr>
+          <w:i/>
+          <w:iCs/>
+        </w:rPr>
+        <w:t xml:space="preserve"> une seule fois lors de la mise sous tension.</w:t>
       </w:r>
       <w:r>
         <w:rPr>
@@ -586,20 +673,44 @@
         <w:rPr>
           <w:i/>
         </w:rPr>
-        <w:t>isponibles dans le dossier du projet (rapport, cdc…)</w:t>
-      </w:r>
-      <w:r>
-        <w:rPr>
-          <w:i/>
-        </w:rPr>
-        <w:t xml:space="preserve"> ainsi que sur le github</w:t>
-      </w:r>
+        <w:t xml:space="preserve">isponibles dans le dossier du projet (rapport, </w:t>
+      </w:r>
+      <w:proofErr w:type="spellStart"/>
+      <w:r>
+        <w:rPr>
+          <w:i/>
+        </w:rPr>
+        <w:t>cdc</w:t>
+      </w:r>
+      <w:proofErr w:type="spellEnd"/>
+      <w:r>
+        <w:rPr>
+          <w:i/>
+        </w:rPr>
+        <w:t>…)</w:t>
+      </w:r>
+      <w:r>
+        <w:rPr>
+          <w:i/>
+        </w:rPr>
+        <w:t xml:space="preserve"> ainsi que sur le </w:t>
+      </w:r>
+      <w:proofErr w:type="spellStart"/>
+      <w:proofErr w:type="gramStart"/>
+      <w:r>
+        <w:rPr>
+          <w:i/>
+        </w:rPr>
+        <w:t>github</w:t>
+      </w:r>
+      <w:proofErr w:type="spellEnd"/>
       <w:r>
         <w:rPr>
           <w:i/>
         </w:rPr>
         <w:t>:</w:t>
       </w:r>
+      <w:proofErr w:type="gramEnd"/>
       <w:r>
         <w:rPr>
           <w:i/>
@@ -847,7 +958,15 @@
           </w:tcPr>
           <w:p>
             <w:r>
-              <w:t>Ajout de toutes les LEDs manquantes</w:t>
+              <w:t xml:space="preserve">Ajout de toutes les </w:t>
+            </w:r>
+            <w:proofErr w:type="spellStart"/>
+            <w:r>
+              <w:t>LEDs</w:t>
+            </w:r>
+            <w:proofErr w:type="spellEnd"/>
+            <w:r>
+              <w:t xml:space="preserve"> manquantes</w:t>
             </w:r>
           </w:p>
         </w:tc>
@@ -1219,7 +1338,15 @@
           </w:tcPr>
           <w:p>
             <w:r>
-              <w:t>Modification du code pour mettre le microcontrôleur de la carte en mode « Sleep » et le réactivé lorsque l’accéléromètre détecte un secouement</w:t>
+              <w:t>Modification du code pour mettre le microcontrôleur de la carte en mode « </w:t>
+            </w:r>
+            <w:proofErr w:type="spellStart"/>
+            <w:r>
+              <w:t>Sleep</w:t>
+            </w:r>
+            <w:proofErr w:type="spellEnd"/>
+            <w:r>
+              <w:t> » et le réactivé lorsque l’accéléromètre détecte un secouement</w:t>
             </w:r>
           </w:p>
         </w:tc>
@@ -1503,7 +1630,21 @@
         <w:rPr>
           <w:i/>
         </w:rPr>
-        <w:t>e MCU est mis en mode Sleep (</w:t>
+        <w:t xml:space="preserve">e MCU est mis en mode </w:t>
+      </w:r>
+      <w:proofErr w:type="spellStart"/>
+      <w:r>
+        <w:rPr>
+          <w:i/>
+        </w:rPr>
+        <w:t>Sleep</w:t>
+      </w:r>
+      <w:proofErr w:type="spellEnd"/>
+      <w:r>
+        <w:rPr>
+          <w:i/>
+        </w:rPr>
+        <w:t xml:space="preserve"> (</w:t>
       </w:r>
       <w:r>
         <w:rPr>
@@ -1569,8 +1710,13 @@
         </w:numPr>
         <w:spacing w:line="256" w:lineRule="auto"/>
       </w:pPr>
-      <w:r>
-        <w:t>PCB_DéElectronique Version « E »</w:t>
+      <w:proofErr w:type="spellStart"/>
+      <w:r>
+        <w:t>PCB_DéElectronique</w:t>
+      </w:r>
+      <w:proofErr w:type="spellEnd"/>
+      <w:r>
+        <w:t xml:space="preserve"> Version « E »</w:t>
       </w:r>
     </w:p>
     <w:p>
@@ -1595,16 +1741,104 @@
         <w:pStyle w:val="Titre1"/>
       </w:pPr>
       <w:r>
-        <w:t>Convention de nommage</w:t>
-      </w:r>
-      <w:r>
-        <w:t xml:space="preserve"> et liens</w:t>
-      </w:r>
+        <w:t>Stockage des fichiers</w:t>
+      </w:r>
+    </w:p>
+    <w:p>
+      <w:r>
+        <w:t xml:space="preserve">Ce fichier sera stocké </w:t>
+      </w:r>
+      <w:r>
+        <w:t xml:space="preserve">dans le dossier </w:t>
+      </w:r>
+      <w:r>
+        <w:rPr>
+          <w:b/>
+          <w:bCs/>
+        </w:rPr>
+        <w:t>/Fichier de modification</w:t>
+      </w:r>
+      <w:r>
+        <w:t xml:space="preserve"> se trouvant dans le chemin</w:t>
+      </w:r>
+      <w:r>
+        <w:t xml:space="preserve"> </w:t>
+      </w:r>
+      <w:r>
+        <w:rPr>
+          <w:b/>
+        </w:rPr>
+        <w:t>/doc</w:t>
+      </w:r>
+      <w:r>
+        <w:rPr>
+          <w:b/>
+        </w:rPr>
+        <w:t>/Version_4</w:t>
+      </w:r>
+      <w:r>
+        <w:t xml:space="preserve"> du projet </w:t>
+      </w:r>
+      <w:r>
+        <w:rPr>
+          <w:i/>
+        </w:rPr>
+        <w:t>PRJ_2113_D-sElectronique</w:t>
+      </w:r>
+      <w:r>
+        <w:t>.</w:t>
+      </w:r>
+    </w:p>
+    <w:p>
+      <w:r>
+        <w:t xml:space="preserve">Les codes sources sont stockés sur le </w:t>
+      </w:r>
+      <w:proofErr w:type="spellStart"/>
+      <w:r>
+        <w:t>github</w:t>
+      </w:r>
+      <w:proofErr w:type="spellEnd"/>
+      <w:r>
+        <w:t xml:space="preserve"> à la racine du dossier </w:t>
+      </w:r>
+      <w:r>
+        <w:rPr>
+          <w:b/>
+          <w:bCs/>
+        </w:rPr>
+        <w:t>/soft</w:t>
+      </w:r>
+      <w:r>
+        <w:t>.</w:t>
+      </w:r>
+    </w:p>
+    <w:p>
+      <w:r>
+        <w:t xml:space="preserve">Lien du </w:t>
+      </w:r>
+      <w:proofErr w:type="spellStart"/>
+      <w:r>
+        <w:t>Github</w:t>
+      </w:r>
+      <w:proofErr w:type="spellEnd"/>
+      <w:r>
+        <w:t> :</w:t>
+      </w:r>
+    </w:p>
+    <w:p>
+      <w:hyperlink r:id="rId8" w:history="1">
+        <w:r>
+          <w:rPr>
+            <w:rStyle w:val="Lienhypertexte"/>
+          </w:rPr>
+          <w:t>https://github.com/ETML-ES-SLO/PRJ_2113_D-sElectronique/tree/Kazanaris-patch-1</w:t>
+        </w:r>
+      </w:hyperlink>
     </w:p>
     <w:p/>
     <w:sectPr>
-      <w:headerReference w:type="default" r:id="rId11"/>
-      <w:footerReference w:type="default" r:id="rId12"/>
+      <w:headerReference w:type="default" r:id="rId9"/>
+      <w:footerReference w:type="default" r:id="rId10"/>
       <w:pgSz w:w="11906" w:h="16838"/>
       <w:pgMar w:top="1417" w:right="1417" w:bottom="1417" w:left="1417" w:header="708" w:footer="708" w:gutter="0"/>
       <w:cols w:space="708"/>
@@ -1612,45 +1846,6 @@
     </w:sectPr>
   </w:body>
 </w:document>
-</file>
-
-<file path=word/comments.xml><?xml version="1.0" encoding="utf-8"?>
-<w:comments xmlns:wpc="http://schemas.microsoft.com/office/word/2010/wordprocessingCanvas" xmlns:cx="http://schemas.microsoft.com/office/drawing/2014/chartex" xmlns:cx1="http://schemas.microsoft.com/office/drawing/2015/9/8/chartex" xmlns:cx2="http://schemas.microsoft.com/office/drawing/2015/10/21/chartex" xmlns:cx3="http://schemas.microsoft.com/office/drawing/2016/5/9/chartex" xmlns:cx4="http://schemas.microsoft.com/office/drawing/2016/5/10/chartex" xmlns:cx5="http://schemas.microsoft.com/office/drawing/2016/5/11/chartex" xmlns:cx6="http://schemas.microsoft.com/office/drawing/2016/5/12/chartex" xmlns:cx7="http://schemas.microsoft.com/office/drawing/2016/5/13/chartex" xmlns:cx8="http://schemas.microsoft.com/office/drawing/2016/5/14/chartex" xmlns:mc="http://schemas.openxmlformats.org/markup-compatibility/2006" xmlns:aink="http://schemas.microsoft.com/office/drawing/2016/ink" xmlns:am3d="http://schemas.microsoft.com/office/drawing/2017/model3d" xmlns:o="urn:schemas-microsoft-com:office:office" xmlns:r="http://schemas.openxmlformats.org/officeDocument/2006/relationships" xmlns:m="http://schemas.openxmlformats.org/officeDocument/2006/math" xmlns:v="urn:schemas-microsoft-com:vml" xmlns:wp14="http://schemas.microsoft.com/office/word/2010/wordprocessingDrawing" xmlns:wp="http://schemas.openxmlformats.org/drawingml/2006/wordprocessingDrawing" xmlns:w10="urn:schemas-microsoft-com:office:word" xmlns:w="http://schemas.openxmlformats.org/wordprocessingml/2006/main" xmlns:w14="http://schemas.microsoft.com/office/word/2010/wordml" xmlns:w15="http://schemas.microsoft.com/office/word/2012/wordml" xmlns:w16cex="http://schemas.microsoft.com/office/word/2018/wordml/cex" xmlns:w16cid="http://schemas.microsoft.com/office/word/2016/wordml/cid" xmlns:w16="http://schemas.microsoft.com/office/word/2018/wordml" xmlns:w16se="http://schemas.microsoft.com/office/word/2015/wordml/symex" xmlns:wpg="http://schemas.microsoft.com/office/word/2010/wordprocessingGroup" xmlns:wpi="http://schemas.microsoft.com/office/word/2010/wordprocessingInk" xmlns:wne="http://schemas.microsoft.com/office/word/2006/wordml" xmlns:wps="http://schemas.microsoft.com/office/word/2010/wordprocessingShape" mc:Ignorable="w14 w15 w16se w16cid w16 w16cex wp14">
-  <w:comment w:id="0" w:author="Philippe Bovey" w:date="2024-02-20T13:41:00Z" w:initials="PB">
-    <w:p>
-      <w:pPr>
-        <w:pStyle w:val="Commentaire"/>
-      </w:pPr>
-      <w:r>
-        <w:rPr>
-          <w:rStyle w:val="Marquedecommentaire"/>
-        </w:rPr>
-        <w:annotationRef/>
-      </w:r>
-      <w:r>
-        <w:t xml:space="preserve">Ajouter : </w:t>
-      </w:r>
-      <w:r>
-        <w:rPr>
-          <w:b/>
-        </w:rPr>
-        <w:t>Hardware – Software</w:t>
-      </w:r>
-    </w:p>
-  </w:comment>
-</w:comments>
-</file>
-
-<file path=word/commentsExtended.xml><?xml version="1.0" encoding="utf-8"?>
-<w15:commentsEx xmlns:wpc="http://schemas.microsoft.com/office/word/2010/wordprocessingCanvas" xmlns:cx="http://schemas.microsoft.com/office/drawing/2014/chartex" xmlns:cx1="http://schemas.microsoft.com/office/drawing/2015/9/8/chartex" xmlns:cx2="http://schemas.microsoft.com/office/drawing/2015/10/21/chartex" xmlns:cx3="http://schemas.microsoft.com/office/drawing/2016/5/9/chartex" xmlns:cx4="http://schemas.microsoft.com/office/drawing/2016/5/10/chartex" xmlns:cx5="http://schemas.microsoft.com/office/drawing/2016/5/11/chartex" xmlns:cx6="http://schemas.microsoft.com/office/drawing/2016/5/12/chartex" xmlns:cx7="http://schemas.microsoft.com/office/drawing/2016/5/13/chartex" xmlns:cx8="http://schemas.microsoft.com/office/drawing/2016/5/14/chartex" xmlns:mc="http://schemas.openxmlformats.org/markup-compatibility/2006" xmlns:aink="http://schemas.microsoft.com/office/drawing/2016/ink" xmlns:am3d="http://schemas.microsoft.com/office/drawing/2017/model3d" xmlns:o="urn:schemas-microsoft-com:office:office" xmlns:r="http://schemas.openxmlformats.org/officeDocument/2006/relationships" xmlns:m="http://schemas.openxmlformats.org/officeDocument/2006/math" xmlns:v="urn:schemas-microsoft-com:vml" xmlns:wp14="http://schemas.microsoft.com/office/word/2010/wordprocessingDrawing" xmlns:wp="http://schemas.openxmlformats.org/drawingml/2006/wordprocessingDrawing" xmlns:w10="urn:schemas-microsoft-com:office:word" xmlns:w="http://schemas.openxmlformats.org/wordprocessingml/2006/main" xmlns:w14="http://schemas.microsoft.com/office/word/2010/wordml" xmlns:w15="http://schemas.microsoft.com/office/word/2012/wordml" xmlns:w16cex="http://schemas.microsoft.com/office/word/2018/wordml/cex" xmlns:w16cid="http://schemas.microsoft.com/office/word/2016/wordml/cid" xmlns:w16="http://schemas.microsoft.com/office/word/2018/wordml" xmlns:w16se="http://schemas.microsoft.com/office/word/2015/wordml/symex" xmlns:wpg="http://schemas.microsoft.com/office/word/2010/wordprocessingGroup" xmlns:wpi="http://schemas.microsoft.com/office/word/2010/wordprocessingInk" xmlns:wne="http://schemas.microsoft.com/office/word/2006/wordml" xmlns:wps="http://schemas.microsoft.com/office/word/2010/wordprocessingShape" mc:Ignorable="w14 w15 w16se w16cid w16 w16cex wp14">
-  <w15:commentEx w15:paraId="37C8F61E" w15:done="0"/>
-</w15:commentsEx>
-</file>
-
-<file path=word/commentsIds.xml><?xml version="1.0" encoding="utf-8"?>
-<w16cid:commentsIds xmlns:wpc="http://schemas.microsoft.com/office/word/2010/wordprocessingCanvas" xmlns:cx="http://schemas.microsoft.com/office/drawing/2014/chartex" xmlns:cx1="http://schemas.microsoft.com/office/drawing/2015/9/8/chartex" xmlns:cx2="http://schemas.microsoft.com/office/drawing/2015/10/21/chartex" xmlns:cx3="http://schemas.microsoft.com/office/drawing/2016/5/9/chartex" xmlns:cx4="http://schemas.microsoft.com/office/drawing/2016/5/10/chartex" xmlns:cx5="http://schemas.microsoft.com/office/drawing/2016/5/11/chartex" xmlns:cx6="http://schemas.microsoft.com/office/drawing/2016/5/12/chartex" xmlns:cx7="http://schemas.microsoft.com/office/drawing/2016/5/13/chartex" xmlns:cx8="http://schemas.microsoft.com/office/drawing/2016/5/14/chartex" xmlns:mc="http://schemas.openxmlformats.org/markup-compatibility/2006" xmlns:aink="http://schemas.microsoft.com/office/drawing/2016/ink" xmlns:am3d="http://schemas.microsoft.com/office/drawing/2017/model3d" xmlns:o="urn:schemas-microsoft-com:office:office" xmlns:r="http://schemas.openxmlformats.org/officeDocument/2006/relationships" xmlns:m="http://schemas.openxmlformats.org/officeDocument/2006/math" xmlns:v="urn:schemas-microsoft-com:vml" xmlns:wp14="http://schemas.microsoft.com/office/word/2010/wordprocessingDrawing" xmlns:wp="http://schemas.openxmlformats.org/drawingml/2006/wordprocessingDrawing" xmlns:w10="urn:schemas-microsoft-com:office:word" xmlns:w="http://schemas.openxmlformats.org/wordprocessingml/2006/main" xmlns:w14="http://schemas.microsoft.com/office/word/2010/wordml" xmlns:w15="http://schemas.microsoft.com/office/word/2012/wordml" xmlns:w16cex="http://schemas.microsoft.com/office/word/2018/wordml/cex" xmlns:w16cid="http://schemas.microsoft.com/office/word/2016/wordml/cid" xmlns:w16="http://schemas.microsoft.com/office/word/2018/wordml" xmlns:w16se="http://schemas.microsoft.com/office/word/2015/wordml/symex" xmlns:wpg="http://schemas.microsoft.com/office/word/2010/wordprocessingGroup" xmlns:wpi="http://schemas.microsoft.com/office/word/2010/wordprocessingInk" xmlns:wne="http://schemas.microsoft.com/office/word/2006/wordml" xmlns:wps="http://schemas.microsoft.com/office/word/2010/wordprocessingShape" mc:Ignorable="w14 w15 w16se w16cid w16 w16cex wp14">
-  <w16cid:commentId w16cid:paraId="37C8F61E" w16cid:durableId="2DC2B5E8"/>
-</w16cid:commentsIds>
 </file>
 
 <file path=word/endnotes.xml><?xml version="1.0" encoding="utf-8"?>
@@ -1888,7 +2083,18 @@
         <w:u w:val="single"/>
         <w:lang w:eastAsia="fr-FR"/>
       </w:rPr>
-      <w:t>ECOLE SUPERIEURE</w:t>
+      <w:t xml:space="preserve">ECOLE </w:t>
+    </w:r>
+    <w:proofErr w:type="gramStart"/>
+    <w:r>
+      <w:rPr>
+        <w:spacing w:val="-3"/>
+        <w:sz w:val="20"/>
+        <w:szCs w:val="20"/>
+        <w:u w:val="single"/>
+        <w:lang w:eastAsia="fr-FR"/>
+      </w:rPr>
+      <w:t>SUPERIEURE</w:t>
     </w:r>
     <w:r>
       <w:rPr>
@@ -1906,6 +2112,7 @@
       </w:rPr>
       <w:tab/>
     </w:r>
+    <w:proofErr w:type="gramEnd"/>
     <w:r>
       <w:rPr>
         <w:szCs w:val="24"/>
@@ -2496,14 +2703,6 @@
     <w:abstractNumId w:val="1"/>
   </w:num>
 </w:numbering>
-</file>
-
-<file path=word/people.xml><?xml version="1.0" encoding="utf-8"?>
-<w15:people xmlns:wpc="http://schemas.microsoft.com/office/word/2010/wordprocessingCanvas" xmlns:cx="http://schemas.microsoft.com/office/drawing/2014/chartex" xmlns:cx1="http://schemas.microsoft.com/office/drawing/2015/9/8/chartex" xmlns:cx2="http://schemas.microsoft.com/office/drawing/2015/10/21/chartex" xmlns:cx3="http://schemas.microsoft.com/office/drawing/2016/5/9/chartex" xmlns:cx4="http://schemas.microsoft.com/office/drawing/2016/5/10/chartex" xmlns:cx5="http://schemas.microsoft.com/office/drawing/2016/5/11/chartex" xmlns:cx6="http://schemas.microsoft.com/office/drawing/2016/5/12/chartex" xmlns:cx7="http://schemas.microsoft.com/office/drawing/2016/5/13/chartex" xmlns:cx8="http://schemas.microsoft.com/office/drawing/2016/5/14/chartex" xmlns:mc="http://schemas.openxmlformats.org/markup-compatibility/2006" xmlns:aink="http://schemas.microsoft.com/office/drawing/2016/ink" xmlns:am3d="http://schemas.microsoft.com/office/drawing/2017/model3d" xmlns:o="urn:schemas-microsoft-com:office:office" xmlns:r="http://schemas.openxmlformats.org/officeDocument/2006/relationships" xmlns:m="http://schemas.openxmlformats.org/officeDocument/2006/math" xmlns:v="urn:schemas-microsoft-com:vml" xmlns:wp14="http://schemas.microsoft.com/office/word/2010/wordprocessingDrawing" xmlns:wp="http://schemas.openxmlformats.org/drawingml/2006/wordprocessingDrawing" xmlns:w10="urn:schemas-microsoft-com:office:word" xmlns:w="http://schemas.openxmlformats.org/wordprocessingml/2006/main" xmlns:w14="http://schemas.microsoft.com/office/word/2010/wordml" xmlns:w15="http://schemas.microsoft.com/office/word/2012/wordml" xmlns:w16cex="http://schemas.microsoft.com/office/word/2018/wordml/cex" xmlns:w16cid="http://schemas.microsoft.com/office/word/2016/wordml/cid" xmlns:w16="http://schemas.microsoft.com/office/word/2018/wordml" xmlns:w16se="http://schemas.microsoft.com/office/word/2015/wordml/symex" xmlns:wpg="http://schemas.microsoft.com/office/word/2010/wordprocessingGroup" xmlns:wpi="http://schemas.microsoft.com/office/word/2010/wordprocessingInk" xmlns:wne="http://schemas.microsoft.com/office/word/2006/wordml" xmlns:wps="http://schemas.microsoft.com/office/word/2010/wordprocessingShape" mc:Ignorable="w14 w15 w16se w16cid w16 w16cex wp14">
-  <w15:person w15:author="Philippe Bovey">
-    <w15:presenceInfo w15:providerId="None" w15:userId="Philippe Bovey"/>
-  </w15:person>
-</w15:people>
 </file>
 
 <file path=word/styles.xml><?xml version="1.0" encoding="utf-8"?>
@@ -3526,6 +3725,29 @@
       <w:szCs w:val="20"/>
     </w:rPr>
   </w:style>
+  <w:style w:type="character" w:styleId="Lienhypertexte">
+    <w:name w:val="Hyperlink"/>
+    <w:basedOn w:val="Policepardfaut"/>
+    <w:uiPriority w:val="99"/>
+    <w:unhideWhenUsed/>
+    <w:rsid w:val="0030112F"/>
+    <w:rPr>
+      <w:color w:val="0563C1" w:themeColor="hyperlink"/>
+      <w:u w:val="single"/>
+    </w:rPr>
+  </w:style>
+  <w:style w:type="character" w:styleId="Mentionnonrsolue">
+    <w:name w:val="Unresolved Mention"/>
+    <w:basedOn w:val="Policepardfaut"/>
+    <w:uiPriority w:val="99"/>
+    <w:semiHidden/>
+    <w:unhideWhenUsed/>
+    <w:rsid w:val="0030112F"/>
+    <w:rPr>
+      <w:color w:val="605E5C"/>
+      <w:shd w:val="clear" w:color="auto" w:fill="E1DFDD"/>
+    </w:rPr>
+  </w:style>
 </w:styles>
 </file>
 

</xml_diff>